<commit_message>
Humanize Assignment 03 submission templates.
Rewrite the report template and final checklist in a more natural student voice while preserving all required evidence and submission criteria.

Made-with: Cursor
</commit_message>
<xml_diff>
--- a/report/Assignment03_Report_Template.docx
+++ b/report/Assignment03_Report_Template.docx
@@ -120,7 +120,18 @@
           <w:sz w:val="24"/>
           <w:sz-cs w:val="24"/>
         </w:rPr>
-        <w:t xml:space="preserve">I confirm that this submission is my own work and follows the academic integrity policy.</w:t>
+        <w:t xml:space="preserve">I confirm that this work is my own. I completed the installation, configuration,</w:t>
+      </w:r>
+    </w:p>
+    <w:p>
+      <w:pPr/>
+      <w:r>
+        <w:rPr>
+          <w:rFonts w:ascii="Helvetica Light" w:hAnsi="Helvetica Light" w:cs="Helvetica Light"/>
+          <w:sz w:val="24"/>
+          <w:sz-cs w:val="24"/>
+        </w:rPr>
+        <w:t xml:space="preserve">and testing steps myself, and I followed Seneca's academic integrity policy.</w:t>
       </w:r>
     </w:p>
     <w:p>
@@ -186,29 +197,40 @@
           <w:sz w:val="24"/>
           <w:sz-cs w:val="24"/>
         </w:rPr>
-        <w:t xml:space="preserve">Screenshot 1:</w:t>
-      </w:r>
-    </w:p>
-    <w:p>
-      <w:pPr/>
-      <w:r>
-        <w:rPr>
-          <w:rFonts w:ascii="Helvetica Light" w:hAnsi="Helvetica Light" w:cs="Helvetica Light"/>
-          <w:sz w:val="24"/>
-          <w:sz-cs w:val="24"/>
-        </w:rPr>
-        <w:t xml:space="preserve">- Label: Elasticsearch running</w:t>
-      </w:r>
-    </w:p>
-    <w:p>
-      <w:pPr/>
-      <w:r>
-        <w:rPr>
-          <w:rFonts w:ascii="Helvetica Light" w:hAnsi="Helvetica Light" w:cs="Helvetica Light"/>
-          <w:sz w:val="24"/>
-          <w:sz-cs w:val="24"/>
-        </w:rPr>
-        <w:t xml:space="preserve">- Required evidence: systemctl active + endpoint check</w:t>
+        <w:t xml:space="preserve">Screenshot 1 - Elasticsearch running</w:t>
+      </w:r>
+    </w:p>
+    <w:p>
+      <w:pPr/>
+      <w:r>
+        <w:rPr>
+          <w:rFonts w:ascii="Helvetica Light" w:hAnsi="Helvetica Light" w:cs="Helvetica Light"/>
+          <w:sz w:val="24"/>
+          <w:sz-cs w:val="24"/>
+        </w:rPr>
+        <w:t xml:space="preserve">- What I checked: service status and local API response</w:t>
+      </w:r>
+    </w:p>
+    <w:p>
+      <w:pPr/>
+      <w:r>
+        <w:rPr>
+          <w:rFonts w:ascii="Helvetica Light" w:hAnsi="Helvetica Light" w:cs="Helvetica Light"/>
+          <w:sz w:val="24"/>
+          <w:sz-cs w:val="24"/>
+        </w:rPr>
+        <w:t xml:space="preserve">- Command(s): `systemctl status elasticsearch --no-pager` and `curl http://127.0.0.1:9200`</w:t>
+      </w:r>
+    </w:p>
+    <w:p>
+      <w:pPr/>
+      <w:r>
+        <w:rPr>
+          <w:rFonts w:ascii="Helvetica Light" w:hAnsi="Helvetica Light" w:cs="Helvetica Light"/>
+          <w:sz w:val="24"/>
+          <w:sz-cs w:val="24"/>
+        </w:rPr>
+        <w:t xml:space="preserve">- My note: [Write 1 short sentence about what you observed]</w:t>
       </w:r>
     </w:p>
     <w:p>
@@ -241,29 +263,40 @@
           <w:sz w:val="24"/>
           <w:sz-cs w:val="24"/>
         </w:rPr>
-        <w:t xml:space="preserve">Screenshot 2:</w:t>
-      </w:r>
-    </w:p>
-    <w:p>
-      <w:pPr/>
-      <w:r>
-        <w:rPr>
-          <w:rFonts w:ascii="Helvetica Light" w:hAnsi="Helvetica Light" w:cs="Helvetica Light"/>
-          <w:sz w:val="24"/>
-          <w:sz-cs w:val="24"/>
-        </w:rPr>
-        <w:t xml:space="preserve">- Label: Logstash running</w:t>
-      </w:r>
-    </w:p>
-    <w:p>
-      <w:pPr/>
-      <w:r>
-        <w:rPr>
-          <w:rFonts w:ascii="Helvetica Light" w:hAnsi="Helvetica Light" w:cs="Helvetica Light"/>
-          <w:sz w:val="24"/>
-          <w:sz-cs w:val="24"/>
-        </w:rPr>
-        <w:t xml:space="preserve">- Required evidence: systemctl active</w:t>
+        <w:t xml:space="preserve">Screenshot 2 - Logstash running</w:t>
+      </w:r>
+    </w:p>
+    <w:p>
+      <w:pPr/>
+      <w:r>
+        <w:rPr>
+          <w:rFonts w:ascii="Helvetica Light" w:hAnsi="Helvetica Light" w:cs="Helvetica Light"/>
+          <w:sz w:val="24"/>
+          <w:sz-cs w:val="24"/>
+        </w:rPr>
+        <w:t xml:space="preserve">- What I checked: service status</w:t>
+      </w:r>
+    </w:p>
+    <w:p>
+      <w:pPr/>
+      <w:r>
+        <w:rPr>
+          <w:rFonts w:ascii="Helvetica Light" w:hAnsi="Helvetica Light" w:cs="Helvetica Light"/>
+          <w:sz w:val="24"/>
+          <w:sz-cs w:val="24"/>
+        </w:rPr>
+        <w:t xml:space="preserve">- Command: `systemctl status logstash --no-pager`</w:t>
+      </w:r>
+    </w:p>
+    <w:p>
+      <w:pPr/>
+      <w:r>
+        <w:rPr>
+          <w:rFonts w:ascii="Helvetica Light" w:hAnsi="Helvetica Light" w:cs="Helvetica Light"/>
+          <w:sz w:val="24"/>
+          <w:sz-cs w:val="24"/>
+        </w:rPr>
+        <w:t xml:space="preserve">- My note: [Write 1 short sentence about startup/health]</w:t>
       </w:r>
     </w:p>
     <w:p>
@@ -296,29 +329,40 @@
           <w:sz w:val="24"/>
           <w:sz-cs w:val="24"/>
         </w:rPr>
-        <w:t xml:space="preserve">Screenshot 3:</w:t>
-      </w:r>
-    </w:p>
-    <w:p>
-      <w:pPr/>
-      <w:r>
-        <w:rPr>
-          <w:rFonts w:ascii="Helvetica Light" w:hAnsi="Helvetica Light" w:cs="Helvetica Light"/>
-          <w:sz w:val="24"/>
-          <w:sz-cs w:val="24"/>
-        </w:rPr>
-        <w:t xml:space="preserve">- Label: Kibana running</w:t>
-      </w:r>
-    </w:p>
-    <w:p>
-      <w:pPr/>
-      <w:r>
-        <w:rPr>
-          <w:rFonts w:ascii="Helvetica Light" w:hAnsi="Helvetica Light" w:cs="Helvetica Light"/>
-          <w:sz w:val="24"/>
-          <w:sz-cs w:val="24"/>
-        </w:rPr>
-        <w:t xml:space="preserve">- Required evidence: browser page and/or API status</w:t>
+        <w:t xml:space="preserve">Screenshot 3 - Kibana running</w:t>
+      </w:r>
+    </w:p>
+    <w:p>
+      <w:pPr/>
+      <w:r>
+        <w:rPr>
+          <w:rFonts w:ascii="Helvetica Light" w:hAnsi="Helvetica Light" w:cs="Helvetica Light"/>
+          <w:sz w:val="24"/>
+          <w:sz-cs w:val="24"/>
+        </w:rPr>
+        <w:t xml:space="preserve">- What I checked: Kibana API status and browser page</w:t>
+      </w:r>
+    </w:p>
+    <w:p>
+      <w:pPr/>
+      <w:r>
+        <w:rPr>
+          <w:rFonts w:ascii="Helvetica Light" w:hAnsi="Helvetica Light" w:cs="Helvetica Light"/>
+          <w:sz w:val="24"/>
+          <w:sz-cs w:val="24"/>
+        </w:rPr>
+        <w:t xml:space="preserve">- Command/Page: `curl http://127.0.0.1:5601/api/status` and Kibana in browser</w:t>
+      </w:r>
+    </w:p>
+    <w:p>
+      <w:pPr/>
+      <w:r>
+        <w:rPr>
+          <w:rFonts w:ascii="Helvetica Light" w:hAnsi="Helvetica Light" w:cs="Helvetica Light"/>
+          <w:sz w:val="24"/>
+          <w:sz-cs w:val="24"/>
+        </w:rPr>
+        <w:t xml:space="preserve">- My note: [Write 1 short sentence about what loaded]</w:t>
       </w:r>
     </w:p>
     <w:p>
@@ -351,29 +395,40 @@
           <w:sz w:val="24"/>
           <w:sz-cs w:val="24"/>
         </w:rPr>
-        <w:t xml:space="preserve">Screenshot 4:</w:t>
-      </w:r>
-    </w:p>
-    <w:p>
-      <w:pPr/>
-      <w:r>
-        <w:rPr>
-          <w:rFonts w:ascii="Helvetica Light" w:hAnsi="Helvetica Light" w:cs="Helvetica Light"/>
-          <w:sz w:val="24"/>
-          <w:sz-cs w:val="24"/>
-        </w:rPr>
-        <w:t xml:space="preserve">- Label: Filebeat running</w:t>
-      </w:r>
-    </w:p>
-    <w:p>
-      <w:pPr/>
-      <w:r>
-        <w:rPr>
-          <w:rFonts w:ascii="Helvetica Light" w:hAnsi="Helvetica Light" w:cs="Helvetica Light"/>
-          <w:sz w:val="24"/>
-          <w:sz-cs w:val="24"/>
-        </w:rPr>
-        <w:t xml:space="preserve">- Required evidence: systemctl active</w:t>
+        <w:t xml:space="preserve">Screenshot 4 - Filebeat running</w:t>
+      </w:r>
+    </w:p>
+    <w:p>
+      <w:pPr/>
+      <w:r>
+        <w:rPr>
+          <w:rFonts w:ascii="Helvetica Light" w:hAnsi="Helvetica Light" w:cs="Helvetica Light"/>
+          <w:sz w:val="24"/>
+          <w:sz-cs w:val="24"/>
+        </w:rPr>
+        <w:t xml:space="preserve">- What I checked: service status</w:t>
+      </w:r>
+    </w:p>
+    <w:p>
+      <w:pPr/>
+      <w:r>
+        <w:rPr>
+          <w:rFonts w:ascii="Helvetica Light" w:hAnsi="Helvetica Light" w:cs="Helvetica Light"/>
+          <w:sz w:val="24"/>
+          <w:sz-cs w:val="24"/>
+        </w:rPr>
+        <w:t xml:space="preserve">- Command: `systemctl status filebeat --no-pager`</w:t>
+      </w:r>
+    </w:p>
+    <w:p>
+      <w:pPr/>
+      <w:r>
+        <w:rPr>
+          <w:rFonts w:ascii="Helvetica Light" w:hAnsi="Helvetica Light" w:cs="Helvetica Light"/>
+          <w:sz w:val="24"/>
+          <w:sz-cs w:val="24"/>
+        </w:rPr>
+        <w:t xml:space="preserve">- My note: [Write 1 short sentence about output]</w:t>
       </w:r>
     </w:p>
     <w:p>
@@ -450,29 +505,40 @@
           <w:sz w:val="24"/>
           <w:sz-cs w:val="24"/>
         </w:rPr>
-        <w:t xml:space="preserve">Screenshot 5:</w:t>
-      </w:r>
-    </w:p>
-    <w:p>
-      <w:pPr/>
-      <w:r>
-        <w:rPr>
-          <w:rFonts w:ascii="Helvetica Light" w:hAnsi="Helvetica Light" w:cs="Helvetica Light"/>
-          <w:sz w:val="24"/>
-          <w:sz-cs w:val="24"/>
-        </w:rPr>
-        <w:t xml:space="preserve">- Label: Apache access/error logs prepared</w:t>
-      </w:r>
-    </w:p>
-    <w:p>
-      <w:pPr/>
-      <w:r>
-        <w:rPr>
-          <w:rFonts w:ascii="Helvetica Light" w:hAnsi="Helvetica Light" w:cs="Helvetica Light"/>
-          <w:sz w:val="24"/>
-          <w:sz-cs w:val="24"/>
-        </w:rPr>
-        <w:t xml:space="preserve">- Required evidence: log files in /var/log/apache2</w:t>
+        <w:t xml:space="preserve">Screenshot 5 - Apache sample logs prepared</w:t>
+      </w:r>
+    </w:p>
+    <w:p>
+      <w:pPr/>
+      <w:r>
+        <w:rPr>
+          <w:rFonts w:ascii="Helvetica Light" w:hAnsi="Helvetica Light" w:cs="Helvetica Light"/>
+          <w:sz w:val="24"/>
+          <w:sz-cs w:val="24"/>
+        </w:rPr>
+        <w:t xml:space="preserve">- What I checked: access + error logs exist in `/var/log/apache2/`</w:t>
+      </w:r>
+    </w:p>
+    <w:p>
+      <w:pPr/>
+      <w:r>
+        <w:rPr>
+          <w:rFonts w:ascii="Helvetica Light" w:hAnsi="Helvetica Light" w:cs="Helvetica Light"/>
+          <w:sz w:val="24"/>
+          <w:sz-cs w:val="24"/>
+        </w:rPr>
+        <w:t xml:space="preserve">- Command(s): `ls -l /var/log/apache2/` and line counts</w:t>
+      </w:r>
+    </w:p>
+    <w:p>
+      <w:pPr/>
+      <w:r>
+        <w:rPr>
+          <w:rFonts w:ascii="Helvetica Light" w:hAnsi="Helvetica Light" w:cs="Helvetica Light"/>
+          <w:sz w:val="24"/>
+          <w:sz-cs w:val="24"/>
+        </w:rPr>
+        <w:t xml:space="preserve">- My note: [Example: access log had ___ lines, error log had ___ lines]</w:t>
       </w:r>
     </w:p>
     <w:p>
@@ -505,29 +571,40 @@
           <w:sz w:val="24"/>
           <w:sz-cs w:val="24"/>
         </w:rPr>
-        <w:t xml:space="preserve">Screenshot 6:</w:t>
-      </w:r>
-    </w:p>
-    <w:p>
-      <w:pPr/>
-      <w:r>
-        <w:rPr>
-          <w:rFonts w:ascii="Helvetica Light" w:hAnsi="Helvetica Light" w:cs="Helvetica Light"/>
-          <w:sz w:val="24"/>
-          <w:sz-cs w:val="24"/>
-        </w:rPr>
-        <w:t xml:space="preserve">- Label: Filebeat Apache module configured</w:t>
-      </w:r>
-    </w:p>
-    <w:p>
-      <w:pPr/>
-      <w:r>
-        <w:rPr>
-          <w:rFonts w:ascii="Helvetica Light" w:hAnsi="Helvetica Light" w:cs="Helvetica Light"/>
-          <w:sz w:val="24"/>
-          <w:sz-cs w:val="24"/>
-        </w:rPr>
-        <w:t xml:space="preserve">- Required evidence: apache module config and setup command output</w:t>
+        <w:t xml:space="preserve">Screenshot 6 - Filebeat Apache module configured</w:t>
+      </w:r>
+    </w:p>
+    <w:p>
+      <w:pPr/>
+      <w:r>
+        <w:rPr>
+          <w:rFonts w:ascii="Helvetica Light" w:hAnsi="Helvetica Light" w:cs="Helvetica Light"/>
+          <w:sz w:val="24"/>
+          <w:sz-cs w:val="24"/>
+        </w:rPr>
+        <w:t xml:space="preserve">- What I checked: apache module enabled and setup completed</w:t>
+      </w:r>
+    </w:p>
+    <w:p>
+      <w:pPr/>
+      <w:r>
+        <w:rPr>
+          <w:rFonts w:ascii="Helvetica Light" w:hAnsi="Helvetica Light" w:cs="Helvetica Light"/>
+          <w:sz w:val="24"/>
+          <w:sz-cs w:val="24"/>
+        </w:rPr>
+        <w:t xml:space="preserve">- Command(s): `filebeat modules list` and `filebeat setup -e`</w:t>
+      </w:r>
+    </w:p>
+    <w:p>
+      <w:pPr/>
+      <w:r>
+        <w:rPr>
+          <w:rFonts w:ascii="Helvetica Light" w:hAnsi="Helvetica Light" w:cs="Helvetica Light"/>
+          <w:sz w:val="24"/>
+          <w:sz-cs w:val="24"/>
+        </w:rPr>
+        <w:t xml:space="preserve">- My note: [Write 1 short sentence]</w:t>
       </w:r>
     </w:p>
     <w:p>
@@ -560,29 +637,40 @@
           <w:sz w:val="24"/>
           <w:sz-cs w:val="24"/>
         </w:rPr>
-        <w:t xml:space="preserve">Screenshot 7:</w:t>
-      </w:r>
-    </w:p>
-    <w:p>
-      <w:pPr/>
-      <w:r>
-        <w:rPr>
-          <w:rFonts w:ascii="Helvetica Light" w:hAnsi="Helvetica Light" w:cs="Helvetica Light"/>
-          <w:sz w:val="24"/>
-          <w:sz-cs w:val="24"/>
-        </w:rPr>
-        <w:t xml:space="preserve">- Label: Ingested document count</w:t>
-      </w:r>
-    </w:p>
-    <w:p>
-      <w:pPr/>
-      <w:r>
-        <w:rPr>
-          <w:rFonts w:ascii="Helvetica Light" w:hAnsi="Helvetica Light" w:cs="Helvetica Light"/>
-          <w:sz w:val="24"/>
-          <w:sz-cs w:val="24"/>
-        </w:rPr>
-        <w:t xml:space="preserve">- Required evidence: _cat/indices and _count output</w:t>
+        <w:t xml:space="preserve">Screenshot 7 - Ingested document count</w:t>
+      </w:r>
+    </w:p>
+    <w:p>
+      <w:pPr/>
+      <w:r>
+        <w:rPr>
+          <w:rFonts w:ascii="Helvetica Light" w:hAnsi="Helvetica Light" w:cs="Helvetica Light"/>
+          <w:sz w:val="24"/>
+          <w:sz-cs w:val="24"/>
+        </w:rPr>
+        <w:t xml:space="preserve">- What I checked: filebeat index + total count in Elasticsearch</w:t>
+      </w:r>
+    </w:p>
+    <w:p>
+      <w:pPr/>
+      <w:r>
+        <w:rPr>
+          <w:rFonts w:ascii="Helvetica Light" w:hAnsi="Helvetica Light" w:cs="Helvetica Light"/>
+          <w:sz w:val="24"/>
+          <w:sz-cs w:val="24"/>
+        </w:rPr>
+        <w:t xml:space="preserve">- Command(s): `_cat/indices` and `_count` request</w:t>
+      </w:r>
+    </w:p>
+    <w:p>
+      <w:pPr/>
+      <w:r>
+        <w:rPr>
+          <w:rFonts w:ascii="Helvetica Light" w:hAnsi="Helvetica Light" w:cs="Helvetica Light"/>
+          <w:sz w:val="24"/>
+          <w:sz-cs w:val="24"/>
+        </w:rPr>
+        <w:t xml:space="preserve">- My note: [Write the count and a short observation]</w:t>
       </w:r>
     </w:p>
     <w:p>
@@ -615,29 +703,40 @@
           <w:sz w:val="24"/>
           <w:sz-cs w:val="24"/>
         </w:rPr>
-        <w:t xml:space="preserve">Screenshot 8:</w:t>
-      </w:r>
-    </w:p>
-    <w:p>
-      <w:pPr/>
-      <w:r>
-        <w:rPr>
-          <w:rFonts w:ascii="Helvetica Light" w:hAnsi="Helvetica Light" w:cs="Helvetica Light"/>
-          <w:sz w:val="24"/>
-          <w:sz-cs w:val="24"/>
-        </w:rPr>
-        <w:t xml:space="preserve">- Label: Filebeat Apache dashboard in Kibana</w:t>
-      </w:r>
-    </w:p>
-    <w:p>
-      <w:pPr/>
-      <w:r>
-        <w:rPr>
-          <w:rFonts w:ascii="Helvetica Light" w:hAnsi="Helvetica Light" w:cs="Helvetica Light"/>
-          <w:sz w:val="24"/>
-          <w:sz-cs w:val="24"/>
-        </w:rPr>
-        <w:t xml:space="preserve">- Required evidence: dashboard visuals</w:t>
+        <w:t xml:space="preserve">Screenshot 8 - Kibana dashboard</w:t>
+      </w:r>
+    </w:p>
+    <w:p>
+      <w:pPr/>
+      <w:r>
+        <w:rPr>
+          <w:rFonts w:ascii="Helvetica Light" w:hAnsi="Helvetica Light" w:cs="Helvetica Light"/>
+          <w:sz w:val="24"/>
+          <w:sz-cs w:val="24"/>
+        </w:rPr>
+        <w:t xml:space="preserve">- What I checked: Filebeat Apache dashboard visualizations</w:t>
+      </w:r>
+    </w:p>
+    <w:p>
+      <w:pPr/>
+      <w:r>
+        <w:rPr>
+          <w:rFonts w:ascii="Helvetica Light" w:hAnsi="Helvetica Light" w:cs="Helvetica Light"/>
+          <w:sz w:val="24"/>
+          <w:sz-cs w:val="24"/>
+        </w:rPr>
+        <w:t xml:space="preserve">- Page: Kibana -&gt; Dashboards -&gt; Filebeat Apache Access and Error Logs</w:t>
+      </w:r>
+    </w:p>
+    <w:p>
+      <w:pPr/>
+      <w:r>
+        <w:rPr>
+          <w:rFonts w:ascii="Helvetica Light" w:hAnsi="Helvetica Light" w:cs="Helvetica Light"/>
+          <w:sz w:val="24"/>
+          <w:sz-cs w:val="24"/>
+        </w:rPr>
+        <w:t xml:space="preserve">- My note: [Mention one useful chart you saw]</w:t>
       </w:r>
     </w:p>
     <w:p>
@@ -670,29 +769,40 @@
           <w:sz w:val="24"/>
           <w:sz-cs w:val="24"/>
         </w:rPr>
-        <w:t xml:space="preserve">Screenshot 9:</w:t>
-      </w:r>
-    </w:p>
-    <w:p>
-      <w:pPr/>
-      <w:r>
-        <w:rPr>
-          <w:rFonts w:ascii="Helvetica Light" w:hAnsi="Helvetica Light" w:cs="Helvetica Light"/>
-          <w:sz w:val="24"/>
-          <w:sz-cs w:val="24"/>
-        </w:rPr>
-        <w:t xml:space="preserve">- Label: Data in Kibana Discover</w:t>
-      </w:r>
-    </w:p>
-    <w:p>
-      <w:pPr/>
-      <w:r>
-        <w:rPr>
-          <w:rFonts w:ascii="Helvetica Light" w:hAnsi="Helvetica Light" w:cs="Helvetica Light"/>
-          <w:sz w:val="24"/>
-          <w:sz-cs w:val="24"/>
-        </w:rPr>
-        <w:t xml:space="preserve">- Required evidence: Apache logs visible and filter example</w:t>
+        <w:t xml:space="preserve">Screenshot 9 - Kibana Discover data</w:t>
+      </w:r>
+    </w:p>
+    <w:p>
+      <w:pPr/>
+      <w:r>
+        <w:rPr>
+          <w:rFonts w:ascii="Helvetica Light" w:hAnsi="Helvetica Light" w:cs="Helvetica Light"/>
+          <w:sz w:val="24"/>
+          <w:sz-cs w:val="24"/>
+        </w:rPr>
+        <w:t xml:space="preserve">- What I checked: Apache logs searchable in Discover</w:t>
+      </w:r>
+    </w:p>
+    <w:p>
+      <w:pPr/>
+      <w:r>
+        <w:rPr>
+          <w:rFonts w:ascii="Helvetica Light" w:hAnsi="Helvetica Light" w:cs="Helvetica Light"/>
+          <w:sz w:val="24"/>
+          <w:sz-cs w:val="24"/>
+        </w:rPr>
+        <w:t xml:space="preserve">- Page: Kibana -&gt; Discover (with at least one filter)</w:t>
+      </w:r>
+    </w:p>
+    <w:p>
+      <w:pPr/>
+      <w:r>
+        <w:rPr>
+          <w:rFonts w:ascii="Helvetica Light" w:hAnsi="Helvetica Light" w:cs="Helvetica Light"/>
+          <w:sz w:val="24"/>
+          <w:sz-cs w:val="24"/>
+        </w:rPr>
+        <w:t xml:space="preserve">- My note: [Mention one query/filter you tested]</w:t>
       </w:r>
     </w:p>
     <w:p>
@@ -769,40 +879,40 @@
           <w:sz w:val="24"/>
           <w:sz-cs w:val="24"/>
         </w:rPr>
-        <w:t xml:space="preserve">List all installation/configuration sources used:</w:t>
-      </w:r>
-    </w:p>
-    <w:p>
-      <w:pPr/>
-      <w:r>
-        <w:rPr>
-          <w:rFonts w:ascii="Helvetica Light" w:hAnsi="Helvetica Light" w:cs="Helvetica Light"/>
-          <w:sz w:val="24"/>
-          <w:sz-cs w:val="24"/>
-        </w:rPr>
-        <w:t xml:space="preserve">1.</w:t>
-      </w:r>
-    </w:p>
-    <w:p>
-      <w:pPr/>
-      <w:r>
-        <w:rPr>
-          <w:rFonts w:ascii="Helvetica Light" w:hAnsi="Helvetica Light" w:cs="Helvetica Light"/>
-          <w:sz w:val="24"/>
-          <w:sz-cs w:val="24"/>
-        </w:rPr>
-        <w:t xml:space="preserve">2.</w:t>
-      </w:r>
-    </w:p>
-    <w:p>
-      <w:pPr/>
-      <w:r>
-        <w:rPr>
-          <w:rFonts w:ascii="Helvetica Light" w:hAnsi="Helvetica Light" w:cs="Helvetica Light"/>
-          <w:sz w:val="24"/>
-          <w:sz-cs w:val="24"/>
-        </w:rPr>
-        <w:t xml:space="preserve">3.</w:t>
+        <w:t xml:space="preserve">I used these references for installation/troubleshooting:</w:t>
+      </w:r>
+    </w:p>
+    <w:p>
+      <w:pPr/>
+      <w:r>
+        <w:rPr>
+          <w:rFonts w:ascii="Helvetica Light" w:hAnsi="Helvetica Light" w:cs="Helvetica Light"/>
+          <w:sz w:val="24"/>
+          <w:sz-cs w:val="24"/>
+        </w:rPr>
+        <w:t xml:space="preserve">1. https://www.elastic.co/</w:t>
+      </w:r>
+    </w:p>
+    <w:p>
+      <w:pPr/>
+      <w:r>
+        <w:rPr>
+          <w:rFonts w:ascii="Helvetica Light" w:hAnsi="Helvetica Light" w:cs="Helvetica Light"/>
+          <w:sz w:val="24"/>
+          <w:sz-cs w:val="24"/>
+        </w:rPr>
+        <w:t xml:space="preserve">2. https://www.cherryservers.com/blog/install-elasticsearch-ubuntu</w:t>
+      </w:r>
+    </w:p>
+    <w:p>
+      <w:pPr/>
+      <w:r>
+        <w:rPr>
+          <w:rFonts w:ascii="Helvetica Light" w:hAnsi="Helvetica Light" w:cs="Helvetica Light"/>
+          <w:sz w:val="24"/>
+          <w:sz-cs w:val="24"/>
+        </w:rPr>
+        <w:t xml:space="preserve">3. [Add any other source you used]</w:t>
       </w:r>
     </w:p>
     <w:p>
@@ -868,128 +978,128 @@
           <w:sz w:val="24"/>
           <w:sz-cs w:val="24"/>
         </w:rPr>
-        <w:t xml:space="preserve">- Report (.docx)</w:t>
-      </w:r>
-    </w:p>
-    <w:p>
-      <w:pPr/>
-      <w:r>
-        <w:rPr>
-          <w:rFonts w:ascii="Helvetica Light" w:hAnsi="Helvetica Light" w:cs="Helvetica Light"/>
-          <w:sz w:val="24"/>
-          <w:sz-cs w:val="24"/>
-        </w:rPr>
-        <w:t xml:space="preserve">- Changed configuration files (list below):</w:t>
-      </w:r>
-    </w:p>
-    <w:p>
-      <w:pPr/>
-      <w:r>
-        <w:rPr>
-          <w:rFonts w:ascii="Helvetica Light" w:hAnsi="Helvetica Light" w:cs="Helvetica Light"/>
-          <w:sz w:val="24"/>
-          <w:sz-cs w:val="24"/>
-        </w:rPr>
-        <w:t xml:space="preserve">  - elasticsearch.yml</w:t>
-      </w:r>
-    </w:p>
-    <w:p>
-      <w:pPr/>
-      <w:r>
-        <w:rPr>
-          <w:rFonts w:ascii="Helvetica Light" w:hAnsi="Helvetica Light" w:cs="Helvetica Light"/>
-          <w:sz w:val="24"/>
-          <w:sz-cs w:val="24"/>
-        </w:rPr>
-        <w:t xml:space="preserve">  - kibana.yml</w:t>
-      </w:r>
-    </w:p>
-    <w:p>
-      <w:pPr/>
-      <w:r>
-        <w:rPr>
-          <w:rFonts w:ascii="Helvetica Light" w:hAnsi="Helvetica Light" w:cs="Helvetica Light"/>
-          <w:sz w:val="24"/>
-          <w:sz-cs w:val="24"/>
-        </w:rPr>
-        <w:t xml:space="preserve">  - logstash-apache.conf</w:t>
-      </w:r>
-    </w:p>
-    <w:p>
-      <w:pPr/>
-      <w:r>
-        <w:rPr>
-          <w:rFonts w:ascii="Helvetica Light" w:hAnsi="Helvetica Light" w:cs="Helvetica Light"/>
-          <w:sz w:val="24"/>
-          <w:sz-cs w:val="24"/>
-        </w:rPr>
-        <w:t xml:space="preserve">  - filebeat.yml</w:t>
-      </w:r>
-    </w:p>
-    <w:p>
-      <w:pPr/>
-      <w:r>
-        <w:rPr>
-          <w:rFonts w:ascii="Helvetica Light" w:hAnsi="Helvetica Light" w:cs="Helvetica Light"/>
-          <w:sz w:val="24"/>
-          <w:sz-cs w:val="24"/>
-        </w:rPr>
-        <w:t xml:space="preserve">  - apache.yml (Filebeat module)</w:t>
-      </w:r>
-    </w:p>
-    <w:p>
-      <w:pPr/>
-      <w:r>
-        <w:rPr>
-          <w:rFonts w:ascii="Helvetica Light" w:hAnsi="Helvetica Light" w:cs="Helvetica Light"/>
-          <w:sz w:val="24"/>
-          <w:sz-cs w:val="24"/>
-        </w:rPr>
-        <w:t xml:space="preserve"/>
-      </w:r>
-    </w:p>
-    <w:p>
-      <w:pPr/>
-      <w:r>
-        <w:rPr>
-          <w:rFonts w:ascii="Helvetica Light" w:hAnsi="Helvetica Light" w:cs="Helvetica Light"/>
-          <w:sz w:val="24"/>
-          <w:sz-cs w:val="24"/>
-        </w:rPr>
-        <w:t xml:space="preserve">Screenshot Compliance Check (must be present on every screenshot):</w:t>
-      </w:r>
-    </w:p>
-    <w:p>
-      <w:pPr/>
-      <w:r>
-        <w:rPr>
-          <w:rFonts w:ascii="Helvetica Light" w:hAnsi="Helvetica Light" w:cs="Helvetica Light"/>
-          <w:sz w:val="24"/>
-          <w:sz-cs w:val="24"/>
-        </w:rPr>
-        <w:t xml:space="preserve">- VM name: [yes/no]</w:t>
-      </w:r>
-    </w:p>
-    <w:p>
-      <w:pPr/>
-      <w:r>
-        <w:rPr>
-          <w:rFonts w:ascii="Helvetica Light" w:hAnsi="Helvetica Light" w:cs="Helvetica Light"/>
-          <w:sz w:val="24"/>
-          <w:sz-cs w:val="24"/>
-        </w:rPr>
-        <w:t xml:space="preserve">- Student number: [yes/no]</w:t>
-      </w:r>
-    </w:p>
-    <w:p>
-      <w:pPr/>
-      <w:r>
-        <w:rPr>
-          <w:rFonts w:ascii="Helvetica Light" w:hAnsi="Helvetica Light" w:cs="Helvetica Light"/>
-          <w:sz w:val="24"/>
-          <w:sz-cs w:val="24"/>
-        </w:rPr>
-        <w:t xml:space="preserve">- Current date/time: [yes/no]</w:t>
+        <w:t xml:space="preserve">- Report file: `Assignment03_&lt;YourName&gt;.docx`</w:t>
+      </w:r>
+    </w:p>
+    <w:p>
+      <w:pPr/>
+      <w:r>
+        <w:rPr>
+          <w:rFonts w:ascii="Helvetica Light" w:hAnsi="Helvetica Light" w:cs="Helvetica Light"/>
+          <w:sz w:val="24"/>
+          <w:sz-cs w:val="24"/>
+        </w:rPr>
+        <w:t xml:space="preserve">- Changed configuration files:</w:t>
+      </w:r>
+    </w:p>
+    <w:p>
+      <w:pPr/>
+      <w:r>
+        <w:rPr>
+          <w:rFonts w:ascii="Helvetica Light" w:hAnsi="Helvetica Light" w:cs="Helvetica Light"/>
+          <w:sz w:val="24"/>
+          <w:sz-cs w:val="24"/>
+        </w:rPr>
+        <w:t xml:space="preserve">  - `/etc/elasticsearch/elasticsearch.yml`</w:t>
+      </w:r>
+    </w:p>
+    <w:p>
+      <w:pPr/>
+      <w:r>
+        <w:rPr>
+          <w:rFonts w:ascii="Helvetica Light" w:hAnsi="Helvetica Light" w:cs="Helvetica Light"/>
+          <w:sz w:val="24"/>
+          <w:sz-cs w:val="24"/>
+        </w:rPr>
+        <w:t xml:space="preserve">  - `/etc/kibana/kibana.yml`</w:t>
+      </w:r>
+    </w:p>
+    <w:p>
+      <w:pPr/>
+      <w:r>
+        <w:rPr>
+          <w:rFonts w:ascii="Helvetica Light" w:hAnsi="Helvetica Light" w:cs="Helvetica Light"/>
+          <w:sz w:val="24"/>
+          <w:sz-cs w:val="24"/>
+        </w:rPr>
+        <w:t xml:space="preserve">  - `/etc/logstash/conf.d/apache.conf`</w:t>
+      </w:r>
+    </w:p>
+    <w:p>
+      <w:pPr/>
+      <w:r>
+        <w:rPr>
+          <w:rFonts w:ascii="Helvetica Light" w:hAnsi="Helvetica Light" w:cs="Helvetica Light"/>
+          <w:sz w:val="24"/>
+          <w:sz-cs w:val="24"/>
+        </w:rPr>
+        <w:t xml:space="preserve">  - `/etc/filebeat/filebeat.yml`</w:t>
+      </w:r>
+    </w:p>
+    <w:p>
+      <w:pPr/>
+      <w:r>
+        <w:rPr>
+          <w:rFonts w:ascii="Helvetica Light" w:hAnsi="Helvetica Light" w:cs="Helvetica Light"/>
+          <w:sz w:val="24"/>
+          <w:sz-cs w:val="24"/>
+        </w:rPr>
+        <w:t xml:space="preserve">  - `/etc/filebeat/modules.d/apache.yml`</w:t>
+      </w:r>
+    </w:p>
+    <w:p>
+      <w:pPr/>
+      <w:r>
+        <w:rPr>
+          <w:rFonts w:ascii="Helvetica Light" w:hAnsi="Helvetica Light" w:cs="Helvetica Light"/>
+          <w:sz w:val="24"/>
+          <w:sz-cs w:val="24"/>
+        </w:rPr>
+        <w:t xml:space="preserve"/>
+      </w:r>
+    </w:p>
+    <w:p>
+      <w:pPr/>
+      <w:r>
+        <w:rPr>
+          <w:rFonts w:ascii="Helvetica Light" w:hAnsi="Helvetica Light" w:cs="Helvetica Light"/>
+          <w:sz w:val="24"/>
+          <w:sz-cs w:val="24"/>
+        </w:rPr>
+        <w:t xml:space="preserve">Screenshot Compliance Check (for every screenshot)</w:t>
+      </w:r>
+    </w:p>
+    <w:p>
+      <w:pPr/>
+      <w:r>
+        <w:rPr>
+          <w:rFonts w:ascii="Helvetica Light" w:hAnsi="Helvetica Light" w:cs="Helvetica Light"/>
+          <w:sz w:val="24"/>
+          <w:sz-cs w:val="24"/>
+        </w:rPr>
+        <w:t xml:space="preserve">- VM name visible: [yes/no]</w:t>
+      </w:r>
+    </w:p>
+    <w:p>
+      <w:pPr/>
+      <w:r>
+        <w:rPr>
+          <w:rFonts w:ascii="Helvetica Light" w:hAnsi="Helvetica Light" w:cs="Helvetica Light"/>
+          <w:sz w:val="24"/>
+          <w:sz-cs w:val="24"/>
+        </w:rPr>
+        <w:t xml:space="preserve">- Student number visible: [yes/no]</w:t>
+      </w:r>
+    </w:p>
+    <w:p>
+      <w:pPr/>
+      <w:r>
+        <w:rPr>
+          <w:rFonts w:ascii="Helvetica Light" w:hAnsi="Helvetica Light" w:cs="Helvetica Light"/>
+          <w:sz w:val="24"/>
+          <w:sz-cs w:val="24"/>
+        </w:rPr>
+        <w:t xml:space="preserve">- Current date/time visible: [yes/no]</w:t>
       </w:r>
     </w:p>
     <w:sectPr/>

</xml_diff>